<commit_message>
Brand fix: BharatPay Index → Bharat Pay Index (three words)
Correct the product name everywhere it appears:
- 3D constellation satellite label
- Hero lede
- Project section title + corner mark
- Meta description, OG/Twitter cards
- Resume DOCX + PDF rebuilt with the corrected name

Also remove the centre "0xViking" wordmark from the 3D scene —
it was crowding the view; the labelled chains and orbiting
products carry the identity on their own.

Co-Authored-By: Claude Opus 4.7 (1M context) <noreply@anthropic.com>
</commit_message>
<xml_diff>
--- a/Praneeth_Reddy_Arikatla_Resume_2026.docx
+++ b/Praneeth_Reddy_Arikatla_Resume_2026.docx
@@ -51,7 +51,7 @@
         </w:rPr>
         <w:t xml:space="preserve">Hyderabad, India  ·  +91 9492292061  ·  </w:t>
       </w:r>
-      <w:hyperlink w:history="1" r:id="rIdjsdq1a261bzgac5heojnz">
+      <w:hyperlink w:history="1" r:id="rIdcpomhsqohyr8icwhzqv-7">
         <w:r>
           <w:rPr>
             <w:rFonts w:ascii="Arial" w:cs="Arial" w:eastAsia="Arial" w:hAnsi="Arial"/>
@@ -67,7 +67,7 @@
         <w:spacing w:after="200"/>
         <w:jc w:val="center"/>
       </w:pPr>
-      <w:hyperlink w:history="1" r:id="rIdfrb4a51vrbugo9cpdi3f3">
+      <w:hyperlink w:history="1" r:id="rId5zksud21cie3rhyvbabrf">
         <w:r>
           <w:rPr>
             <w:rFonts w:ascii="Arial" w:cs="Arial" w:eastAsia="Arial" w:hAnsi="Arial"/>
@@ -86,7 +86,7 @@
         </w:rPr>
         <w:t xml:space="preserve">  ·  </w:t>
       </w:r>
-      <w:hyperlink w:history="1" r:id="rIduptbdp8j6axstnwjtafrt">
+      <w:hyperlink w:history="1" r:id="rIds98onz3ffu_95xvfrjvci">
         <w:r>
           <w:rPr>
             <w:rFonts w:ascii="Arial" w:cs="Arial" w:eastAsia="Arial" w:hAnsi="Arial"/>
@@ -105,7 +105,7 @@
         </w:rPr>
         <w:t xml:space="preserve">  ·  </w:t>
       </w:r>
-      <w:hyperlink w:history="1" r:id="rIdq32tfs1173-vuee0fusjg">
+      <w:hyperlink w:history="1" r:id="rId_ucx9cjfla8bwtykbgmlm">
         <w:r>
           <w:rPr>
             <w:rFonts w:ascii="Arial" w:cs="Arial" w:eastAsia="Arial" w:hAnsi="Arial"/>
@@ -124,7 +124,7 @@
         </w:rPr>
         <w:t xml:space="preserve">  ·  </w:t>
       </w:r>
-      <w:hyperlink w:history="1" r:id="rId7rrfmtzhedpxjhoec4du3">
+      <w:hyperlink w:history="1" r:id="rIdkaiq9plw5xts_uou6tcgj">
         <w:r>
           <w:rPr>
             <w:rFonts w:ascii="Arial" w:cs="Arial" w:eastAsia="Arial" w:hAnsi="Arial"/>
@@ -299,7 +299,7 @@
           <w:sz w:val="21"/>
           <w:szCs w:val="21"/>
         </w:rPr>
-        <w:t xml:space="preserve">ByteHash, OrbitUPI, and BharatPay Index</w:t>
+        <w:t xml:space="preserve">ByteHash, OrbitUPI, and Bharat Pay Index</w:t>
       </w:r>
       <w:r>
         <w:rPr>
@@ -1551,7 +1551,7 @@
           <w:sz w:val="22"/>
           <w:szCs w:val="22"/>
         </w:rPr>
-        <w:t xml:space="preserve">BharatPay Index</w:t>
+        <w:t xml:space="preserve">Bharat Pay Index</w:t>
       </w:r>
       <w:r>
         <w:rPr>
@@ -1603,7 +1603,7 @@
           <w:sz w:val="21"/>
           <w:szCs w:val="21"/>
         </w:rPr>
-        <w:t xml:space="preserve">BharatPay Index</w:t>
+        <w:t xml:space="preserve">Bharat Pay Index</w:t>
       </w:r>
       <w:r>
         <w:rPr>
@@ -2361,7 +2361,7 @@
           <w:sz w:val="21"/>
           <w:szCs w:val="21"/>
         </w:rPr>
-        <w:t xml:space="preserve">BharatPay Index</w:t>
+        <w:t xml:space="preserve">Bharat Pay Index</w:t>
       </w:r>
       <w:r>
         <w:rPr>

</xml_diff>